<commit_message>
ZFI_ACDOCA_JVSO1_RECON: drop transaction-currency (WSL/TSL) comparison
Arnav, 21/10/26: one grouping key can hold rows in several transaction
currencies, so the WSL total is meaningless. Removed end to end: ACDOCA
SUM( wsl ), JVSO1 tsl, the three TC output columns and the TSL
assumption. Only HSL and KSL are compared now. 384 -> 367 lines.
NOTES, ISSUES, Assumptions & Queries (queries 2 and 6 closed) and TS
updated, docx copies regenerated.

Co-Authored-By: Claude Fable 5.1 <noreply@anthropic.com>
Claude-Session: https://claude.ai/code/session_01JtuzTy1YChd4KgVpWEPuuV
</commit_message>
<xml_diff>
--- a/FSD/ZFI_ACDOCA_JVSO1_RECON_Assumptions_and_Queries.docx
+++ b/FSD/ZFI_ACDOCA_JVSO1_RECON_Assumptions_and_Queries.docx
@@ -12,7 +12,7 @@
     </w:p>
     <w:p>
       <w:r>
-        <w:t>Project OVL · requirement received in chat on 19/10/2026 · prepared 19/10/2026</w:t>
+        <w:t>Project OVL · requirement received in chat on 19/10/2026 · prepared 19/10/2026 · updated 21/10/2026</w:t>
       </w:r>
     </w:p>
     <w:p>
@@ -24,6 +24,18 @@
           <w:i/>
         </w:rPr>
         <w:t>selection screen with company code, fiscal year and period as select-options; fetch ACDOCA entries (ledger 0L, TIMESTAMP date part before 27/09/2026); pass their primary keys to JVSO1 (ledger 4A, record type 0, version 1) and find the matching record; compare HSL, KSL, WSL and show the difference; totals on venture, equity group, account, recovery indicator, year and period.</w:t>
+      </w:r>
+      <w:r>
+        <w:t xml:space="preserve"> Update 21/10/2026: </w:t>
+      </w:r>
+      <w:r>
+        <w:rPr>
+          <w:b/>
+        </w:rPr>
+        <w:t>WSL is dropped</w:t>
+      </w:r>
+      <w:r>
+        <w:t xml:space="preserve"> — a key can hold rows in several transaction currencies. Only HSL and KSL are compared.</w:t>
       </w:r>
     </w:p>
     <w:p>
@@ -408,7 +420,7 @@
               <w:rPr>
                 <w:sz w:val="18"/>
               </w:rPr>
-              <w:t xml:space="preserve">ACDOCA has </w:t>
+              <w:t xml:space="preserve">~~ACDOCA </w:t>
             </w:r>
             <w:r>
               <w:rPr>
@@ -421,20 +433,7 @@
               <w:rPr>
                 <w:sz w:val="18"/>
               </w:rPr>
-              <w:t xml:space="preserve">; JVSO1 has no </w:t>
-            </w:r>
-            <w:r>
-              <w:rPr>
-                <w:rFonts w:ascii="Consolas" w:hAnsi="Consolas"/>
-                <w:sz w:val="18"/>
-              </w:rPr>
-              <w:t>WSL</w:t>
-            </w:r>
-            <w:r>
-              <w:rPr>
-                <w:sz w:val="18"/>
-              </w:rPr>
-              <w:t xml:space="preserve">, its transaction-currency amount is </w:t>
+              <w:t xml:space="preserve"> vs JVSO1 </w:t>
             </w:r>
             <w:r>
               <w:rPr>
@@ -447,33 +446,7 @@
               <w:rPr>
                 <w:sz w:val="18"/>
               </w:rPr>
-              <w:t xml:space="preserve">. Is </w:t>
-            </w:r>
-            <w:r>
-              <w:rPr>
-                <w:rFonts w:ascii="Consolas" w:hAnsi="Consolas"/>
-                <w:sz w:val="18"/>
-              </w:rPr>
-              <w:t>ACDOCA-WSL</w:t>
-            </w:r>
-            <w:r>
-              <w:rPr>
-                <w:sz w:val="18"/>
-              </w:rPr>
-              <w:t xml:space="preserve"> vs </w:t>
-            </w:r>
-            <w:r>
-              <w:rPr>
-                <w:rFonts w:ascii="Consolas" w:hAnsi="Consolas"/>
-                <w:sz w:val="18"/>
-              </w:rPr>
-              <w:t>JVSO1-TSL</w:t>
-            </w:r>
-            <w:r>
-              <w:rPr>
-                <w:sz w:val="18"/>
-              </w:rPr>
-              <w:t xml:space="preserve"> the intended pair?</w:t>
+              <w:t xml:space="preserve"> as the transaction-currency pair?~~</w:t>
             </w:r>
           </w:p>
         </w:tc>
@@ -507,9 +480,16 @@
             </w:r>
             <w:r>
               <w:rPr>
+                <w:b/>
                 <w:sz w:val="18"/>
               </w:rPr>
-              <w:t>Yes — SAP's correction tool compares exactly this pair.</w:t>
+              <w:t>Closed 21/10/2026</w:t>
+            </w:r>
+            <w:r>
+              <w:rPr>
+                <w:sz w:val="18"/>
+              </w:rPr>
+              <w:t xml:space="preserve"> — transaction currency removed from the report.</w:t>
             </w:r>
           </w:p>
         </w:tc>
@@ -527,7 +507,7 @@
               <w:rPr>
                 <w:sz w:val="18"/>
               </w:rPr>
-              <w:t>If a different JVSO1 column was meant, one field in the JVSO1 SELECT and one assignment change.</w:t>
+              <w:t>—</w:t>
             </w:r>
           </w:p>
         </w:tc>
@@ -945,7 +925,7 @@
               <w:rPr>
                 <w:sz w:val="18"/>
               </w:rPr>
-              <w:t>Transaction-currency totals: inside one key, lines in different transaction currencies are summed together. Acceptable?</w:t>
+              <w:t>~~Transaction-currency totals summed across currencies inside one key?~~</w:t>
             </w:r>
           </w:p>
         </w:tc>
@@ -963,7 +943,32 @@
               <w:rPr>
                 <w:sz w:val="18"/>
               </w:rPr>
-              <w:t>"compare ... wsl" with the six-key grouping</w:t>
+              <w:t>—</w:t>
+            </w:r>
+          </w:p>
+        </w:tc>
+        <w:tc>
+          <w:tcPr>
+            <w:tcW w:type="dxa" w:w="1728"/>
+          </w:tcPr>
+          <w:p>
+            <w:r>
+              <w:rPr>
+                <w:sz w:val="18"/>
+              </w:rPr>
+            </w:r>
+            <w:r>
+              <w:rPr>
+                <w:b/>
+                <w:sz w:val="18"/>
+              </w:rPr>
+              <w:t>Closed 21/10/2026</w:t>
+            </w:r>
+            <w:r>
+              <w:rPr>
+                <w:sz w:val="18"/>
+              </w:rPr>
+              <w:t xml:space="preserve"> — this is why WSL was dropped.</w:t>
             </w:r>
           </w:p>
         </w:tc>
@@ -981,51 +986,7 @@
               <w:rPr>
                 <w:sz w:val="18"/>
               </w:rPr>
-              <w:t>Summed as requested.</w:t>
-            </w:r>
-          </w:p>
-        </w:tc>
-        <w:tc>
-          <w:tcPr>
-            <w:tcW w:type="dxa" w:w="1728"/>
-          </w:tcPr>
-          <w:p>
-            <w:r>
-              <w:rPr>
-                <w:sz w:val="18"/>
-              </w:rPr>
-            </w:r>
-            <w:r>
-              <w:rPr>
-                <w:sz w:val="18"/>
-              </w:rPr>
-              <w:t xml:space="preserve">Mixed-currency keys give meaningless TC columns. Add </w:t>
-            </w:r>
-            <w:r>
-              <w:rPr>
-                <w:rFonts w:ascii="Consolas" w:hAnsi="Consolas"/>
-                <w:sz w:val="18"/>
-              </w:rPr>
-              <w:t>RWCUR</w:t>
-            </w:r>
-            <w:r>
-              <w:rPr>
-                <w:sz w:val="18"/>
-              </w:rPr>
-              <w:t xml:space="preserve"> / </w:t>
-            </w:r>
-            <w:r>
-              <w:rPr>
-                <w:rFonts w:ascii="Consolas" w:hAnsi="Consolas"/>
-                <w:sz w:val="18"/>
-              </w:rPr>
-              <w:t>RTCUR</w:t>
-            </w:r>
-            <w:r>
-              <w:rPr>
-                <w:sz w:val="18"/>
-              </w:rPr>
-              <w:t xml:space="preserve"> to the grouping key if that occurs. HSL/KSL are unaffected.</w:t>
+              <w:t>—</w:t>
             </w:r>
           </w:p>
         </w:tc>

</xml_diff>